<commit_message>
fix(2026): Word "Update Table" refreshes all contents page numbers
The static contents entries are now the cached result of a TOC field.
Word fills bare PAGEREF fields updated on open with 1, and "Update
Table" found no table to update, so page numbers could only be fixed
one entry at a time. References > Update Table > "Update page numbers
only" now repaginates and refreshes every entry at once, keeping the
2026 styling.

Co-Authored-By: Claude Opus 5.5 <noreply@anthropic.com>
</commit_message>
<xml_diff>
--- a/test/output/brand-2026.docx
+++ b/test/output/brand-2026.docx
@@ -748,6 +748,15 @@
         <w:spacing w:after="0" w:before="200" w:line="240"/>
         <w:ind w:left="1474" w:hanging="1474"/>
       </w:pPr>
+      <w:r>
+        <w:fldChar w:fldCharType="begin"/>
+      </w:r>
+      <w:r>
+        <w:instrText xml:space="preserve"> TOC \o "2-4" \h \z </w:instrText>
+      </w:r>
+      <w:r>
+        <w:fldChar w:fldCharType="separate"/>
+      </w:r>
       <w:hyperlink w:history="1" w:anchor="_toc_1">
         <w:r>
           <w:rPr>
@@ -2933,6 +2942,9 @@
           <w:fldChar w:fldCharType="end"/>
         </w:r>
       </w:hyperlink>
+      <w:r>
+        <w:fldChar w:fldCharType="end"/>
+      </w:r>
     </w:p>
     <w:p>
       <w:pPr>
@@ -3117,7 +3129,7 @@
         </w:rPr>
         <w:t xml:space="preserve"> and a </w:t>
       </w:r>
-      <w:hyperlink w:history="1" r:id="rId7ljqa3adijwyqlxrklgrn">
+      <w:hyperlink w:history="1" r:id="rIddq1ozsio6chmyzxhhzc9h">
         <w:r>
           <w:rPr>
             <w:rFonts w:ascii="Roboto" w:cs="Roboto" w:eastAsia="Roboto" w:hAnsi="Roboto"/>
@@ -4607,7 +4619,7 @@
               </w:rPr>
               <w:t xml:space="preserve">See </w:t>
             </w:r>
-            <w:hyperlink w:history="1" r:id="rId5sy6hywf-sobfuzsspvdk">
+            <w:hyperlink w:history="1" r:id="rIdb4xusxfcxi09ojpgcz8xt">
               <w:r>
                 <w:rPr>
                   <w:rFonts w:ascii="Roboto" w:cs="Roboto" w:eastAsia="Roboto" w:hAnsi="Roboto"/>

</xml_diff>

<commit_message>
fix(2026): Word keeps the styled contents page on open
1.6.1 still asked Word to update fields on open. Clicking Yes on that
prompt rebuilt the contents TOC field in Word's default TOC styles,
dropping the CHAPTER labels and rules. Fields are no longer updated on
open; References > Update Table > "Update page numbers only" fills in
the page numbers and keeps the styling.

Co-Authored-By: Claude Opus 5.5 <noreply@anthropic.com>
</commit_message>
<xml_diff>
--- a/test/output/brand-2026.docx
+++ b/test/output/brand-2026.docx
@@ -791,7 +791,7 @@
             <w:sz w:val="16"/>
             <w:szCs w:val="16"/>
           </w:rPr>
-          <w:fldChar w:fldCharType="begin" w:dirty="true"/>
+          <w:fldChar w:fldCharType="begin"/>
         </w:r>
         <w:r>
           <w:rPr>
@@ -878,7 +878,7 @@
             <w:sz w:val="16"/>
             <w:szCs w:val="16"/>
           </w:rPr>
-          <w:fldChar w:fldCharType="begin" w:dirty="true"/>
+          <w:fldChar w:fldCharType="begin"/>
         </w:r>
         <w:r>
           <w:rPr>
@@ -965,7 +965,7 @@
             <w:sz w:val="16"/>
             <w:szCs w:val="16"/>
           </w:rPr>
-          <w:fldChar w:fldCharType="begin" w:dirty="true"/>
+          <w:fldChar w:fldCharType="begin"/>
         </w:r>
         <w:r>
           <w:rPr>
@@ -1052,7 +1052,7 @@
             <w:sz w:val="16"/>
             <w:szCs w:val="16"/>
           </w:rPr>
-          <w:fldChar w:fldCharType="begin" w:dirty="true"/>
+          <w:fldChar w:fldCharType="begin"/>
         </w:r>
         <w:r>
           <w:rPr>
@@ -1129,7 +1129,7 @@
             <w:sz w:val="16"/>
             <w:szCs w:val="16"/>
           </w:rPr>
-          <w:fldChar w:fldCharType="begin" w:dirty="true"/>
+          <w:fldChar w:fldCharType="begin"/>
         </w:r>
         <w:r>
           <w:rPr>
@@ -1206,7 +1206,7 @@
             <w:sz w:val="16"/>
             <w:szCs w:val="16"/>
           </w:rPr>
-          <w:fldChar w:fldCharType="begin" w:dirty="true"/>
+          <w:fldChar w:fldCharType="begin"/>
         </w:r>
         <w:r>
           <w:rPr>
@@ -1293,7 +1293,7 @@
             <w:sz w:val="16"/>
             <w:szCs w:val="16"/>
           </w:rPr>
-          <w:fldChar w:fldCharType="begin" w:dirty="true"/>
+          <w:fldChar w:fldCharType="begin"/>
         </w:r>
         <w:r>
           <w:rPr>
@@ -1370,7 +1370,7 @@
             <w:sz w:val="16"/>
             <w:szCs w:val="16"/>
           </w:rPr>
-          <w:fldChar w:fldCharType="begin" w:dirty="true"/>
+          <w:fldChar w:fldCharType="begin"/>
         </w:r>
         <w:r>
           <w:rPr>
@@ -1447,7 +1447,7 @@
             <w:sz w:val="16"/>
             <w:szCs w:val="16"/>
           </w:rPr>
-          <w:fldChar w:fldCharType="begin" w:dirty="true"/>
+          <w:fldChar w:fldCharType="begin"/>
         </w:r>
         <w:r>
           <w:rPr>
@@ -1524,7 +1524,7 @@
             <w:sz w:val="16"/>
             <w:szCs w:val="16"/>
           </w:rPr>
-          <w:fldChar w:fldCharType="begin" w:dirty="true"/>
+          <w:fldChar w:fldCharType="begin"/>
         </w:r>
         <w:r>
           <w:rPr>
@@ -1611,7 +1611,7 @@
             <w:sz w:val="16"/>
             <w:szCs w:val="16"/>
           </w:rPr>
-          <w:fldChar w:fldCharType="begin" w:dirty="true"/>
+          <w:fldChar w:fldCharType="begin"/>
         </w:r>
         <w:r>
           <w:rPr>
@@ -1698,7 +1698,7 @@
             <w:sz w:val="16"/>
             <w:szCs w:val="16"/>
           </w:rPr>
-          <w:fldChar w:fldCharType="begin" w:dirty="true"/>
+          <w:fldChar w:fldCharType="begin"/>
         </w:r>
         <w:r>
           <w:rPr>
@@ -1785,7 +1785,7 @@
             <w:sz w:val="16"/>
             <w:szCs w:val="16"/>
           </w:rPr>
-          <w:fldChar w:fldCharType="begin" w:dirty="true"/>
+          <w:fldChar w:fldCharType="begin"/>
         </w:r>
         <w:r>
           <w:rPr>
@@ -1862,7 +1862,7 @@
             <w:sz w:val="16"/>
             <w:szCs w:val="16"/>
           </w:rPr>
-          <w:fldChar w:fldCharType="begin" w:dirty="true"/>
+          <w:fldChar w:fldCharType="begin"/>
         </w:r>
         <w:r>
           <w:rPr>
@@ -1939,7 +1939,7 @@
             <w:sz w:val="16"/>
             <w:szCs w:val="16"/>
           </w:rPr>
-          <w:fldChar w:fldCharType="begin" w:dirty="true"/>
+          <w:fldChar w:fldCharType="begin"/>
         </w:r>
         <w:r>
           <w:rPr>
@@ -2016,7 +2016,7 @@
             <w:sz w:val="16"/>
             <w:szCs w:val="16"/>
           </w:rPr>
-          <w:fldChar w:fldCharType="begin" w:dirty="true"/>
+          <w:fldChar w:fldCharType="begin"/>
         </w:r>
         <w:r>
           <w:rPr>
@@ -2103,7 +2103,7 @@
             <w:sz w:val="16"/>
             <w:szCs w:val="16"/>
           </w:rPr>
-          <w:fldChar w:fldCharType="begin" w:dirty="true"/>
+          <w:fldChar w:fldCharType="begin"/>
         </w:r>
         <w:r>
           <w:rPr>
@@ -2190,7 +2190,7 @@
             <w:sz w:val="16"/>
             <w:szCs w:val="16"/>
           </w:rPr>
-          <w:fldChar w:fldCharType="begin" w:dirty="true"/>
+          <w:fldChar w:fldCharType="begin"/>
         </w:r>
         <w:r>
           <w:rPr>
@@ -2267,7 +2267,7 @@
             <w:sz w:val="16"/>
             <w:szCs w:val="16"/>
           </w:rPr>
-          <w:fldChar w:fldCharType="begin" w:dirty="true"/>
+          <w:fldChar w:fldCharType="begin"/>
         </w:r>
         <w:r>
           <w:rPr>
@@ -2344,7 +2344,7 @@
             <w:sz w:val="16"/>
             <w:szCs w:val="16"/>
           </w:rPr>
-          <w:fldChar w:fldCharType="begin" w:dirty="true"/>
+          <w:fldChar w:fldCharType="begin"/>
         </w:r>
         <w:r>
           <w:rPr>
@@ -2421,7 +2421,7 @@
             <w:sz w:val="16"/>
             <w:szCs w:val="16"/>
           </w:rPr>
-          <w:fldChar w:fldCharType="begin" w:dirty="true"/>
+          <w:fldChar w:fldCharType="begin"/>
         </w:r>
         <w:r>
           <w:rPr>
@@ -2508,7 +2508,7 @@
             <w:sz w:val="16"/>
             <w:szCs w:val="16"/>
           </w:rPr>
-          <w:fldChar w:fldCharType="begin" w:dirty="true"/>
+          <w:fldChar w:fldCharType="begin"/>
         </w:r>
         <w:r>
           <w:rPr>
@@ -2585,7 +2585,7 @@
             <w:sz w:val="16"/>
             <w:szCs w:val="16"/>
           </w:rPr>
-          <w:fldChar w:fldCharType="begin" w:dirty="true"/>
+          <w:fldChar w:fldCharType="begin"/>
         </w:r>
         <w:r>
           <w:rPr>
@@ -2662,7 +2662,7 @@
             <w:sz w:val="16"/>
             <w:szCs w:val="16"/>
           </w:rPr>
-          <w:fldChar w:fldCharType="begin" w:dirty="true"/>
+          <w:fldChar w:fldCharType="begin"/>
         </w:r>
         <w:r>
           <w:rPr>
@@ -2739,7 +2739,7 @@
             <w:sz w:val="16"/>
             <w:szCs w:val="16"/>
           </w:rPr>
-          <w:fldChar w:fldCharType="begin" w:dirty="true"/>
+          <w:fldChar w:fldCharType="begin"/>
         </w:r>
         <w:r>
           <w:rPr>
@@ -2816,7 +2816,7 @@
             <w:sz w:val="16"/>
             <w:szCs w:val="16"/>
           </w:rPr>
-          <w:fldChar w:fldCharType="begin" w:dirty="true"/>
+          <w:fldChar w:fldCharType="begin"/>
         </w:r>
         <w:r>
           <w:rPr>
@@ -2903,7 +2903,7 @@
             <w:sz w:val="16"/>
             <w:szCs w:val="16"/>
           </w:rPr>
-          <w:fldChar w:fldCharType="begin" w:dirty="true"/>
+          <w:fldChar w:fldCharType="begin"/>
         </w:r>
         <w:r>
           <w:rPr>
@@ -3129,7 +3129,7 @@
         </w:rPr>
         <w:t xml:space="preserve"> and a </w:t>
       </w:r>
-      <w:hyperlink w:history="1" r:id="rIddq1ozsio6chmyzxhhzc9h">
+      <w:hyperlink w:history="1" r:id="rIdylfw53_xhffuj3jrwauuf">
         <w:r>
           <w:rPr>
             <w:rFonts w:ascii="Roboto" w:cs="Roboto" w:eastAsia="Roboto" w:hAnsi="Roboto"/>
@@ -4619,7 +4619,7 @@
               </w:rPr>
               <w:t xml:space="preserve">See </w:t>
             </w:r>
-            <w:hyperlink w:history="1" r:id="rIdb4xusxfcxi09ojpgcz8xt">
+            <w:hyperlink w:history="1" r:id="rIdfgdgtz91ojiyteheqc13v">
               <w:r>
                 <w:rPr>
                   <w:rFonts w:ascii="Roboto" w:cs="Roboto" w:eastAsia="Roboto" w:hAnsi="Roboto"/>

</xml_diff>

<commit_message>
fix(2026): Word links to a heading jump to that heading
Markdown links to "#heading-id" were written as external hyperlinks,
so Word opened the bare "#id" and jumped to the top of the document.
They are now internal links to the heading's contents-page bookmark.

Co-Authored-By: Claude Opus 5.5 <noreply@anthropic.com>
</commit_message>
<xml_diff>
--- a/test/output/brand-2026.docx
+++ b/test/output/brand-2026.docx
@@ -3129,7 +3129,7 @@
         </w:rPr>
         <w:t xml:space="preserve"> and a </w:t>
       </w:r>
-      <w:hyperlink w:history="1" r:id="rIdylfw53_xhffuj3jrwauuf">
+      <w:hyperlink w:history="1" r:id="rId1_pwodvwfenezt1ndfvlr">
         <w:r>
           <w:rPr>
             <w:rFonts w:ascii="Roboto" w:cs="Roboto" w:eastAsia="Roboto" w:hAnsi="Roboto"/>
@@ -4619,7 +4619,7 @@
               </w:rPr>
               <w:t xml:space="preserve">See </w:t>
             </w:r>
-            <w:hyperlink w:history="1" r:id="rIdfgdgtz91ojiyteheqc13v">
+            <w:hyperlink w:history="1" r:id="rIdhm6iaism7aoujvfdawt97">
               <w:r>
                 <w:rPr>
                   <w:rFonts w:ascii="Roboto" w:cs="Roboto" w:eastAsia="Roboto" w:hAnsi="Roboto"/>

</xml_diff>

<commit_message>
fix(2026): bold section numbers; PDF embeds Roboto as real fonts
- H3/H4 numbers are Roboto Mono bold, like the CHAPTER labels. The
  regular weight looked faint beside the bold title.
- Chrome embeds a variable font in a PDF as Type 3 glyph outlines,
  which PDF viewers draw thinner than real fonts. The 2026 PDF now
  uses static Regular/Bold/Italic/Bold Italic instances of Roboto and
  Roboto Mono (templates/fonts/static/, cut from the repo's variable
  fonts with fontTools varLib.instancer), which embed as TrueType.
  HTML keeps the variable fonts.

Co-Authored-By: Claude Opus 5.5 <noreply@anthropic.com>
</commit_message>
<xml_diff>
--- a/test/output/brand-2026.docx
+++ b/test/output/brand-2026.docx
@@ -3362,7 +3362,7 @@
         </w:rPr>
         <w:t xml:space="preserve"> and a </w:t>
       </w:r>
-      <w:hyperlink w:history="1" r:id="rIdduxyzazpxwsmnab-qac-r">
+      <w:hyperlink w:history="1" r:id="rId6lk_sroe6sisgrbbwjijr">
         <w:r>
           <w:rPr>
             <w:rFonts w:ascii="Roboto" w:cs="Roboto" w:eastAsia="Roboto" w:hAnsi="Roboto"/>
@@ -3884,6 +3884,8 @@
       <w:r>
         <w:rPr>
           <w:rFonts w:ascii="Roboto Mono" w:cs="Roboto Mono" w:eastAsia="Roboto Mono" w:hAnsi="Roboto Mono"/>
+          <w:b/>
+          <w:bCs/>
           <w:color w:val="C85A8A"/>
           <w:spacing w:val="-30"/>
           <w:sz w:val="20"/>
@@ -3894,6 +3896,8 @@
       <w:r>
         <w:rPr>
           <w:rFonts w:ascii="Roboto Mono" w:cs="Roboto Mono" w:eastAsia="Roboto Mono" w:hAnsi="Roboto Mono"/>
+          <w:b/>
+          <w:bCs/>
           <w:color w:val="C85A8A"/>
           <w:sz w:val="20"/>
           <w:szCs w:val="20"/>
@@ -3903,6 +3907,8 @@
       <w:r>
         <w:rPr>
           <w:rFonts w:ascii="Roboto Mono" w:cs="Roboto Mono" w:eastAsia="Roboto Mono" w:hAnsi="Roboto Mono"/>
+          <w:b/>
+          <w:bCs/>
           <w:color w:val="C85A8A"/>
           <w:spacing w:val="60"/>
           <w:sz w:val="20"/>
@@ -4533,6 +4539,8 @@
       <w:r>
         <w:rPr>
           <w:rFonts w:ascii="Roboto Mono" w:cs="Roboto Mono" w:eastAsia="Roboto Mono" w:hAnsi="Roboto Mono"/>
+          <w:b/>
+          <w:bCs/>
           <w:color w:val="C85A8A"/>
           <w:spacing w:val="-30"/>
           <w:sz w:val="20"/>
@@ -4543,6 +4551,8 @@
       <w:r>
         <w:rPr>
           <w:rFonts w:ascii="Roboto Mono" w:cs="Roboto Mono" w:eastAsia="Roboto Mono" w:hAnsi="Roboto Mono"/>
+          <w:b/>
+          <w:bCs/>
           <w:color w:val="C85A8A"/>
           <w:sz w:val="20"/>
           <w:szCs w:val="20"/>
@@ -4552,6 +4562,8 @@
       <w:r>
         <w:rPr>
           <w:rFonts w:ascii="Roboto Mono" w:cs="Roboto Mono" w:eastAsia="Roboto Mono" w:hAnsi="Roboto Mono"/>
+          <w:b/>
+          <w:bCs/>
           <w:color w:val="C85A8A"/>
           <w:spacing w:val="60"/>
           <w:sz w:val="20"/>
@@ -4904,7 +4916,7 @@
               </w:rPr>
               <w:t xml:space="preserve">See </w:t>
             </w:r>
-            <w:hyperlink w:history="1" r:id="rIdch4xctqer0pyrplpy1lfu">
+            <w:hyperlink w:history="1" r:id="rIdsatqhy5slondk1wnabyan">
               <w:r>
                 <w:rPr>
                   <w:rFonts w:ascii="Roboto" w:cs="Roboto" w:eastAsia="Roboto" w:hAnsi="Roboto"/>
@@ -5111,6 +5123,8 @@
       <w:r>
         <w:rPr>
           <w:rFonts w:ascii="Roboto Mono" w:cs="Roboto Mono" w:eastAsia="Roboto Mono" w:hAnsi="Roboto Mono"/>
+          <w:b/>
+          <w:bCs/>
           <w:color w:val="C85A8A"/>
           <w:spacing w:val="-30"/>
           <w:sz w:val="20"/>
@@ -5121,6 +5135,8 @@
       <w:r>
         <w:rPr>
           <w:rFonts w:ascii="Roboto Mono" w:cs="Roboto Mono" w:eastAsia="Roboto Mono" w:hAnsi="Roboto Mono"/>
+          <w:b/>
+          <w:bCs/>
           <w:color w:val="C85A8A"/>
           <w:sz w:val="20"/>
           <w:szCs w:val="20"/>
@@ -5130,6 +5146,8 @@
       <w:r>
         <w:rPr>
           <w:rFonts w:ascii="Roboto Mono" w:cs="Roboto Mono" w:eastAsia="Roboto Mono" w:hAnsi="Roboto Mono"/>
+          <w:b/>
+          <w:bCs/>
           <w:color w:val="C85A8A"/>
           <w:spacing w:val="60"/>
           <w:sz w:val="20"/>
@@ -5312,6 +5330,8 @@
       <w:r>
         <w:rPr>
           <w:rFonts w:ascii="Roboto Mono" w:cs="Roboto Mono" w:eastAsia="Roboto Mono" w:hAnsi="Roboto Mono"/>
+          <w:b/>
+          <w:bCs/>
           <w:color w:val="C85A8A"/>
           <w:spacing w:val="-30"/>
           <w:sz w:val="20"/>
@@ -5322,6 +5342,8 @@
       <w:r>
         <w:rPr>
           <w:rFonts w:ascii="Roboto Mono" w:cs="Roboto Mono" w:eastAsia="Roboto Mono" w:hAnsi="Roboto Mono"/>
+          <w:b/>
+          <w:bCs/>
           <w:color w:val="C85A8A"/>
           <w:sz w:val="20"/>
           <w:szCs w:val="20"/>
@@ -5331,6 +5353,8 @@
       <w:r>
         <w:rPr>
           <w:rFonts w:ascii="Roboto Mono" w:cs="Roboto Mono" w:eastAsia="Roboto Mono" w:hAnsi="Roboto Mono"/>
+          <w:b/>
+          <w:bCs/>
           <w:color w:val="C85A8A"/>
           <w:spacing w:val="60"/>
           <w:sz w:val="20"/>
@@ -5503,6 +5527,8 @@
       <w:r>
         <w:rPr>
           <w:rFonts w:ascii="Roboto Mono" w:cs="Roboto Mono" w:eastAsia="Roboto Mono" w:hAnsi="Roboto Mono"/>
+          <w:b/>
+          <w:bCs/>
           <w:color w:val="C85A8A"/>
           <w:spacing w:val="-30"/>
           <w:sz w:val="20"/>
@@ -5513,6 +5539,8 @@
       <w:r>
         <w:rPr>
           <w:rFonts w:ascii="Roboto Mono" w:cs="Roboto Mono" w:eastAsia="Roboto Mono" w:hAnsi="Roboto Mono"/>
+          <w:b/>
+          <w:bCs/>
           <w:color w:val="C85A8A"/>
           <w:sz w:val="20"/>
           <w:szCs w:val="20"/>
@@ -5522,6 +5550,8 @@
       <w:r>
         <w:rPr>
           <w:rFonts w:ascii="Roboto Mono" w:cs="Roboto Mono" w:eastAsia="Roboto Mono" w:hAnsi="Roboto Mono"/>
+          <w:b/>
+          <w:bCs/>
           <w:color w:val="C85A8A"/>
           <w:spacing w:val="60"/>
           <w:sz w:val="20"/>
@@ -6094,6 +6124,8 @@
       <w:r>
         <w:rPr>
           <w:rFonts w:ascii="Roboto Mono" w:cs="Roboto Mono" w:eastAsia="Roboto Mono" w:hAnsi="Roboto Mono"/>
+          <w:b/>
+          <w:bCs/>
           <w:color w:val="C85A8A"/>
           <w:spacing w:val="-30"/>
           <w:sz w:val="20"/>
@@ -6104,6 +6136,8 @@
       <w:r>
         <w:rPr>
           <w:rFonts w:ascii="Roboto Mono" w:cs="Roboto Mono" w:eastAsia="Roboto Mono" w:hAnsi="Roboto Mono"/>
+          <w:b/>
+          <w:bCs/>
           <w:color w:val="C85A8A"/>
           <w:sz w:val="20"/>
           <w:szCs w:val="20"/>
@@ -6113,6 +6147,8 @@
       <w:r>
         <w:rPr>
           <w:rFonts w:ascii="Roboto Mono" w:cs="Roboto Mono" w:eastAsia="Roboto Mono" w:hAnsi="Roboto Mono"/>
+          <w:b/>
+          <w:bCs/>
           <w:color w:val="C85A8A"/>
           <w:spacing w:val="60"/>
           <w:sz w:val="20"/>
@@ -6187,6 +6223,8 @@
       <w:r>
         <w:rPr>
           <w:rFonts w:ascii="Roboto Mono" w:cs="Roboto Mono" w:eastAsia="Roboto Mono" w:hAnsi="Roboto Mono"/>
+          <w:b/>
+          <w:bCs/>
           <w:color w:val="C85A8A"/>
           <w:spacing w:val="-30"/>
           <w:sz w:val="20"/>
@@ -6197,6 +6235,8 @@
       <w:r>
         <w:rPr>
           <w:rFonts w:ascii="Roboto Mono" w:cs="Roboto Mono" w:eastAsia="Roboto Mono" w:hAnsi="Roboto Mono"/>
+          <w:b/>
+          <w:bCs/>
           <w:color w:val="C85A8A"/>
           <w:sz w:val="20"/>
           <w:szCs w:val="20"/>
@@ -6206,6 +6246,8 @@
       <w:r>
         <w:rPr>
           <w:rFonts w:ascii="Roboto Mono" w:cs="Roboto Mono" w:eastAsia="Roboto Mono" w:hAnsi="Roboto Mono"/>
+          <w:b/>
+          <w:bCs/>
           <w:color w:val="C85A8A"/>
           <w:spacing w:val="60"/>
           <w:sz w:val="20"/>
@@ -6280,6 +6322,8 @@
       <w:r>
         <w:rPr>
           <w:rFonts w:ascii="Roboto Mono" w:cs="Roboto Mono" w:eastAsia="Roboto Mono" w:hAnsi="Roboto Mono"/>
+          <w:b/>
+          <w:bCs/>
           <w:color w:val="C85A8A"/>
           <w:spacing w:val="-30"/>
           <w:sz w:val="20"/>
@@ -6290,6 +6334,8 @@
       <w:r>
         <w:rPr>
           <w:rFonts w:ascii="Roboto Mono" w:cs="Roboto Mono" w:eastAsia="Roboto Mono" w:hAnsi="Roboto Mono"/>
+          <w:b/>
+          <w:bCs/>
           <w:color w:val="C85A8A"/>
           <w:sz w:val="20"/>
           <w:szCs w:val="20"/>
@@ -6299,6 +6345,8 @@
       <w:r>
         <w:rPr>
           <w:rFonts w:ascii="Roboto Mono" w:cs="Roboto Mono" w:eastAsia="Roboto Mono" w:hAnsi="Roboto Mono"/>
+          <w:b/>
+          <w:bCs/>
           <w:color w:val="C85A8A"/>
           <w:spacing w:val="60"/>
           <w:sz w:val="20"/>
@@ -6471,6 +6519,8 @@
       <w:r>
         <w:rPr>
           <w:rFonts w:ascii="Roboto Mono" w:cs="Roboto Mono" w:eastAsia="Roboto Mono" w:hAnsi="Roboto Mono"/>
+          <w:b/>
+          <w:bCs/>
           <w:color w:val="C85A8A"/>
           <w:sz w:val="20"/>
           <w:szCs w:val="20"/>
@@ -6480,6 +6530,8 @@
       <w:r>
         <w:rPr>
           <w:rFonts w:ascii="Roboto Mono" w:cs="Roboto Mono" w:eastAsia="Roboto Mono" w:hAnsi="Roboto Mono"/>
+          <w:b/>
+          <w:bCs/>
           <w:color w:val="C85A8A"/>
           <w:spacing w:val="-30"/>
           <w:sz w:val="20"/>
@@ -6490,6 +6542,8 @@
       <w:r>
         <w:rPr>
           <w:rFonts w:ascii="Roboto Mono" w:cs="Roboto Mono" w:eastAsia="Roboto Mono" w:hAnsi="Roboto Mono"/>
+          <w:b/>
+          <w:bCs/>
           <w:color w:val="C85A8A"/>
           <w:sz w:val="20"/>
           <w:szCs w:val="20"/>
@@ -6499,6 +6553,8 @@
       <w:r>
         <w:rPr>
           <w:rFonts w:ascii="Roboto Mono" w:cs="Roboto Mono" w:eastAsia="Roboto Mono" w:hAnsi="Roboto Mono"/>
+          <w:b/>
+          <w:bCs/>
           <w:color w:val="C85A8A"/>
           <w:spacing w:val="60"/>
           <w:sz w:val="20"/>
@@ -6541,6 +6597,8 @@
       <w:r>
         <w:rPr>
           <w:rFonts w:ascii="Roboto Mono" w:cs="Roboto Mono" w:eastAsia="Roboto Mono" w:hAnsi="Roboto Mono"/>
+          <w:b/>
+          <w:bCs/>
           <w:color w:val="C85A8A"/>
           <w:sz w:val="18"/>
           <w:szCs w:val="18"/>
@@ -6550,6 +6608,8 @@
       <w:r>
         <w:rPr>
           <w:rFonts w:ascii="Roboto Mono" w:cs="Roboto Mono" w:eastAsia="Roboto Mono" w:hAnsi="Roboto Mono"/>
+          <w:b/>
+          <w:bCs/>
           <w:color w:val="C85A8A"/>
           <w:spacing w:val="-27"/>
           <w:sz w:val="18"/>
@@ -6560,6 +6620,8 @@
       <w:r>
         <w:rPr>
           <w:rFonts w:ascii="Roboto Mono" w:cs="Roboto Mono" w:eastAsia="Roboto Mono" w:hAnsi="Roboto Mono"/>
+          <w:b/>
+          <w:bCs/>
           <w:color w:val="C85A8A"/>
           <w:spacing w:val="-27"/>
           <w:sz w:val="18"/>
@@ -6570,6 +6632,8 @@
       <w:r>
         <w:rPr>
           <w:rFonts w:ascii="Roboto Mono" w:cs="Roboto Mono" w:eastAsia="Roboto Mono" w:hAnsi="Roboto Mono"/>
+          <w:b/>
+          <w:bCs/>
           <w:color w:val="C85A8A"/>
           <w:sz w:val="18"/>
           <w:szCs w:val="18"/>
@@ -6579,6 +6643,8 @@
       <w:r>
         <w:rPr>
           <w:rFonts w:ascii="Roboto Mono" w:cs="Roboto Mono" w:eastAsia="Roboto Mono" w:hAnsi="Roboto Mono"/>
+          <w:b/>
+          <w:bCs/>
           <w:color w:val="C85A8A"/>
           <w:spacing w:val="72"/>
           <w:sz w:val="18"/>
@@ -6615,6 +6681,8 @@
       <w:r>
         <w:rPr>
           <w:rFonts w:ascii="Roboto Mono" w:cs="Roboto Mono" w:eastAsia="Roboto Mono" w:hAnsi="Roboto Mono"/>
+          <w:b/>
+          <w:bCs/>
           <w:color w:val="C85A8A"/>
           <w:sz w:val="20"/>
           <w:szCs w:val="20"/>
@@ -6624,6 +6692,8 @@
       <w:r>
         <w:rPr>
           <w:rFonts w:ascii="Roboto Mono" w:cs="Roboto Mono" w:eastAsia="Roboto Mono" w:hAnsi="Roboto Mono"/>
+          <w:b/>
+          <w:bCs/>
           <w:color w:val="C85A8A"/>
           <w:spacing w:val="-30"/>
           <w:sz w:val="20"/>
@@ -6634,6 +6704,8 @@
       <w:r>
         <w:rPr>
           <w:rFonts w:ascii="Roboto Mono" w:cs="Roboto Mono" w:eastAsia="Roboto Mono" w:hAnsi="Roboto Mono"/>
+          <w:b/>
+          <w:bCs/>
           <w:color w:val="C85A8A"/>
           <w:sz w:val="20"/>
           <w:szCs w:val="20"/>
@@ -6643,6 +6715,8 @@
       <w:r>
         <w:rPr>
           <w:rFonts w:ascii="Roboto Mono" w:cs="Roboto Mono" w:eastAsia="Roboto Mono" w:hAnsi="Roboto Mono"/>
+          <w:b/>
+          <w:bCs/>
           <w:color w:val="C85A8A"/>
           <w:spacing w:val="60"/>
           <w:sz w:val="20"/>
@@ -6716,6 +6790,8 @@
       <w:r>
         <w:rPr>
           <w:rFonts w:ascii="Roboto Mono" w:cs="Roboto Mono" w:eastAsia="Roboto Mono" w:hAnsi="Roboto Mono"/>
+          <w:b/>
+          <w:bCs/>
           <w:color w:val="C85A8A"/>
           <w:sz w:val="20"/>
           <w:szCs w:val="20"/>
@@ -6725,6 +6801,8 @@
       <w:r>
         <w:rPr>
           <w:rFonts w:ascii="Roboto Mono" w:cs="Roboto Mono" w:eastAsia="Roboto Mono" w:hAnsi="Roboto Mono"/>
+          <w:b/>
+          <w:bCs/>
           <w:color w:val="C85A8A"/>
           <w:spacing w:val="-30"/>
           <w:sz w:val="20"/>
@@ -6735,6 +6813,8 @@
       <w:r>
         <w:rPr>
           <w:rFonts w:ascii="Roboto Mono" w:cs="Roboto Mono" w:eastAsia="Roboto Mono" w:hAnsi="Roboto Mono"/>
+          <w:b/>
+          <w:bCs/>
           <w:color w:val="C85A8A"/>
           <w:sz w:val="20"/>
           <w:szCs w:val="20"/>
@@ -6744,6 +6824,8 @@
       <w:r>
         <w:rPr>
           <w:rFonts w:ascii="Roboto Mono" w:cs="Roboto Mono" w:eastAsia="Roboto Mono" w:hAnsi="Roboto Mono"/>
+          <w:b/>
+          <w:bCs/>
           <w:color w:val="C85A8A"/>
           <w:spacing w:val="60"/>
           <w:sz w:val="20"/>
@@ -7053,6 +7135,8 @@
       <w:r>
         <w:rPr>
           <w:rFonts w:ascii="Roboto Mono" w:cs="Roboto Mono" w:eastAsia="Roboto Mono" w:hAnsi="Roboto Mono"/>
+          <w:b/>
+          <w:bCs/>
           <w:color w:val="C85A8A"/>
           <w:sz w:val="20"/>
           <w:szCs w:val="20"/>
@@ -7062,6 +7146,8 @@
       <w:r>
         <w:rPr>
           <w:rFonts w:ascii="Roboto Mono" w:cs="Roboto Mono" w:eastAsia="Roboto Mono" w:hAnsi="Roboto Mono"/>
+          <w:b/>
+          <w:bCs/>
           <w:color w:val="C85A8A"/>
           <w:spacing w:val="-30"/>
           <w:sz w:val="20"/>
@@ -7072,6 +7158,8 @@
       <w:r>
         <w:rPr>
           <w:rFonts w:ascii="Roboto Mono" w:cs="Roboto Mono" w:eastAsia="Roboto Mono" w:hAnsi="Roboto Mono"/>
+          <w:b/>
+          <w:bCs/>
           <w:color w:val="C85A8A"/>
           <w:sz w:val="20"/>
           <w:szCs w:val="20"/>
@@ -7081,6 +7169,8 @@
       <w:r>
         <w:rPr>
           <w:rFonts w:ascii="Roboto Mono" w:cs="Roboto Mono" w:eastAsia="Roboto Mono" w:hAnsi="Roboto Mono"/>
+          <w:b/>
+          <w:bCs/>
           <w:color w:val="C85A8A"/>
           <w:spacing w:val="60"/>
           <w:sz w:val="20"/>
@@ -7142,6 +7232,8 @@
       <w:r>
         <w:rPr>
           <w:rFonts w:ascii="Roboto Mono" w:cs="Roboto Mono" w:eastAsia="Roboto Mono" w:hAnsi="Roboto Mono"/>
+          <w:b/>
+          <w:bCs/>
           <w:color w:val="C85A8A"/>
           <w:sz w:val="20"/>
           <w:szCs w:val="20"/>
@@ -7151,6 +7243,8 @@
       <w:r>
         <w:rPr>
           <w:rFonts w:ascii="Roboto Mono" w:cs="Roboto Mono" w:eastAsia="Roboto Mono" w:hAnsi="Roboto Mono"/>
+          <w:b/>
+          <w:bCs/>
           <w:color w:val="C85A8A"/>
           <w:spacing w:val="-30"/>
           <w:sz w:val="20"/>
@@ -7161,6 +7255,8 @@
       <w:r>
         <w:rPr>
           <w:rFonts w:ascii="Roboto Mono" w:cs="Roboto Mono" w:eastAsia="Roboto Mono" w:hAnsi="Roboto Mono"/>
+          <w:b/>
+          <w:bCs/>
           <w:color w:val="C85A8A"/>
           <w:sz w:val="20"/>
           <w:szCs w:val="20"/>
@@ -7170,6 +7266,8 @@
       <w:r>
         <w:rPr>
           <w:rFonts w:ascii="Roboto Mono" w:cs="Roboto Mono" w:eastAsia="Roboto Mono" w:hAnsi="Roboto Mono"/>
+          <w:b/>
+          <w:bCs/>
           <w:color w:val="C85A8A"/>
           <w:spacing w:val="60"/>
           <w:sz w:val="20"/>
@@ -7302,6 +7400,8 @@
       <w:r>
         <w:rPr>
           <w:rFonts w:ascii="Roboto Mono" w:cs="Roboto Mono" w:eastAsia="Roboto Mono" w:hAnsi="Roboto Mono"/>
+          <w:b/>
+          <w:bCs/>
           <w:color w:val="C85A8A"/>
           <w:sz w:val="20"/>
           <w:szCs w:val="20"/>
@@ -7311,6 +7411,8 @@
       <w:r>
         <w:rPr>
           <w:rFonts w:ascii="Roboto Mono" w:cs="Roboto Mono" w:eastAsia="Roboto Mono" w:hAnsi="Roboto Mono"/>
+          <w:b/>
+          <w:bCs/>
           <w:color w:val="C85A8A"/>
           <w:spacing w:val="-30"/>
           <w:sz w:val="20"/>
@@ -7321,6 +7423,8 @@
       <w:r>
         <w:rPr>
           <w:rFonts w:ascii="Roboto Mono" w:cs="Roboto Mono" w:eastAsia="Roboto Mono" w:hAnsi="Roboto Mono"/>
+          <w:b/>
+          <w:bCs/>
           <w:color w:val="C85A8A"/>
           <w:sz w:val="20"/>
           <w:szCs w:val="20"/>
@@ -7330,6 +7434,8 @@
       <w:r>
         <w:rPr>
           <w:rFonts w:ascii="Roboto Mono" w:cs="Roboto Mono" w:eastAsia="Roboto Mono" w:hAnsi="Roboto Mono"/>
+          <w:b/>
+          <w:bCs/>
           <w:color w:val="C85A8A"/>
           <w:spacing w:val="60"/>
           <w:sz w:val="20"/>

</xml_diff>